<commit_message>
sci antlantic and drafts
</commit_message>
<xml_diff>
--- a/Posters/Health_Research_Symposium/abstract v3.docx
+++ b/Posters/Health_Research_Symposium/abstract v3.docx
@@ -6,15 +6,17 @@
       <w:pPr>
         <w:pStyle w:val="NormalWeb"/>
         <w:spacing w:before="0" w:beforeAutospacing="0"/>
+        <w:rPr>
+          <w:b/>
+          <w:bCs/>
+        </w:rPr>
       </w:pPr>
       <w:r>
-        <w:t>TITLE</w:t>
-      </w:r>
-      <w:r>
-        <w:t xml:space="preserve">: </w:t>
-      </w:r>
-      <w:r>
-        <w:t>Acute Stress Decreases Glutamate Transmission through Endocannabinoid-CB1 Receptors in the Female Rat Dorsomedial Hypothalamus</w:t>
+        <w:rPr>
+          <w:b/>
+          <w:bCs/>
+        </w:rPr>
+        <w:t>TITLE: Acute Stress Decreases Glutamate Transmission through Endocannabinoid-CB1 Receptors in the Female Rat Dorsomedial Hypothalamus</w:t>
       </w:r>
     </w:p>
     <w:p>
@@ -29,31 +31,10 @@
         <w:spacing w:before="0" w:beforeAutospacing="0"/>
       </w:pPr>
       <w:r>
-        <w:t xml:space="preserve">Stress was once a purely adaptive survival mechanism. But in </w:t>
-      </w:r>
-      <w:r>
-        <w:t>our modern landscape of high social stress and high</w:t>
-      </w:r>
-      <w:r>
-        <w:t>-</w:t>
-      </w:r>
-      <w:r>
-        <w:t>calorie, palatable foods,</w:t>
-      </w:r>
-      <w:r>
-        <w:t xml:space="preserve"> it </w:t>
-      </w:r>
-      <w:r>
-        <w:t>contributes to obesity</w:t>
-      </w:r>
-      <w:r>
-        <w:t xml:space="preserve">, rates of which </w:t>
-      </w:r>
-      <w:r>
-        <w:t xml:space="preserve">continue to rise, </w:t>
-      </w:r>
-      <w:r>
-        <w:t>with New Brunswick having one of the highest obesity levels in Canada.</w:t>
+        <w:t xml:space="preserve">Stress was once a purely adaptive survival mechanism. But in our modern landscape of high social stress and high-calorie, palatable foods, it contributes to obesity, rates of which </w:t>
+      </w:r>
+      <w:r>
+        <w:t>continue to rise, with New Brunswick having one of the highest obesity levels in Canada.</w:t>
       </w:r>
     </w:p>
     <w:p>
@@ -385,10 +366,7 @@
         <w:t xml:space="preserve">a </w:t>
       </w:r>
       <w:r>
-        <w:t>neuronal mechanism</w:t>
-      </w:r>
-      <w:r>
-        <w:t xml:space="preserve"> </w:t>
+        <w:t xml:space="preserve">neuronal mechanism </w:t>
       </w:r>
       <w:r>
         <w:t>that link</w:t>

</xml_diff>